<commit_message>
Rename Yugiri Mikata to Yugiri Tokara throughout project
</commit_message>
<xml_diff>
--- a/GM plans/GM_01_Karavan_deviaty_pechatok_GM-only.docx
+++ b/GM plans/GM_01_Karavan_deviaty_pechatok_GM-only.docx
@@ -72,7 +72,7 @@
               <w:spacing w:after="40"/>
             </w:pPr>
             <w:r>
-              <w:t>Розраховано на вільну текстову RP без кубиків. Центральний персонаж за замовчуванням: дорослий Юґірі Міката.</w:t>
+              <w:t>Розраховано на вільну текстову RP без кубиків. Центральний персонаж за замовчуванням: дорослий Юґірі Токара.</w:t>
             </w:r>
           </w:p>
           <w:p>
@@ -1202,7 +1202,7 @@
         <w:t xml:space="preserve">2.  </w:t>
       </w:r>
       <w:r>
-        <w:t>Визначити, чи Міката входить у караван відкрито як шинобі Конохи, чи під цивільним прикриттям. Базовий варіант: прикриття писаря-реєстратора Кей Мацуда.</w:t>
+        <w:t>Визначити, чи Токара входить у караван відкрито як шинобі Конохи, чи під цивільним прикриттям. Базовий варіант: прикриття писаря-реєстратора Кей Мацуда.</w:t>
       </w:r>
     </w:p>
     <w:p>
@@ -1297,7 +1297,7 @@
         <w:rPr>
           <w:b/>
         </w:rPr>
-        <w:t xml:space="preserve">Юґірі Міката: </w:t>
+        <w:t xml:space="preserve">Юґірі Токара: </w:t>
       </w:r>
       <w:r>
         <w:t>токубецу-джонін Конохи, спеціаліст із Henge, приховування чакри, цивільних ролей, соціальної розвідки та тиску на людей. Він не найсильніший фронтовий боєць у каравані, але найкраще пристосований до середовища, де важливіша чужа впевненість, ніж кунай.</w:t>
@@ -1350,7 +1350,7 @@
         <w:pStyle w:val="Heading2"/>
       </w:pPr>
       <w:r>
-        <w:t>Як замінити Мікату</w:t>
+        <w:t>Як замінити Токару</w:t>
       </w:r>
     </w:p>
     <w:p>
@@ -1855,7 +1855,7 @@
               <w:rPr>
                 <w:sz w:val="16"/>
               </w:rPr>
-              <w:t>Міката може навчити представників дворів базовому виявленню чакрових слідів. Це рятує слабших, але поширює секрети Конохи й створює нових небезпечних гравців.</w:t>
+              <w:t>Токара може навчити представників дворів базовому виявленню чакрових слідів. Це рятує слабших, але поширює секрети Конохи й створює нових небезпечних гравців.</w:t>
             </w:r>
           </w:p>
         </w:tc>
@@ -1903,7 +1903,7 @@
               <w:rPr>
                 <w:sz w:val="16"/>
               </w:rPr>
-              <w:t>Міката прикриває Куреху, але вона не немовля і не морально бездоганна. Вона бреше Конохі, краде документи й здатна використати чужу смерть.</w:t>
+              <w:t>Токара прикриває Куреху, але вона не немовля і не морально бездоганна. Вона бреше Конохі, краде документи й здатна використати чужу смерть.</w:t>
             </w:r>
           </w:p>
         </w:tc>
@@ -2050,7 +2050,7 @@
               <w:spacing w:after="40"/>
             </w:pPr>
             <w:r>
-              <w:t>Асума дивиться на Мікату: «При дворі люди рідко брешуть прямо. Вони просто говорять так, щоб ти сам вибрав неправильну правду».</w:t>
+              <w:t>Асума дивиться на Токару: «При дворі люди рідко брешуть прямо. Вони просто говорять так, щоб ти сам вибрав неправильну правду».</w:t>
             </w:r>
           </w:p>
         </w:tc>
@@ -2122,7 +2122,7 @@
         <w:t xml:space="preserve">Публічний склад Конохи: </w:t>
       </w:r>
       <w:r>
-        <w:t>Райдо як військовий представник, четверо чунінів охорони, медик і два зв’язківці. Міката не записаний як шинобі.</w:t>
+        <w:t>Райдо як військовий представник, четверо чунінів охорони, медик і два зв’язківці. Токара не записаний як шинобі.</w:t>
       </w:r>
     </w:p>
     <w:p>
@@ -2262,7 +2262,7 @@
     </w:p>
     <w:p>
       <w:r>
-        <w:t>Райдо є видимим щитом і політичним запобіжником. Він не ходить слідом за Мікатою й не розв’язує його сцени. Його функції: підтвердити наказ, перекрити коридор, надати двох людей, витримати офіційний тиск, організувати евакуацію. Він не знає всіх прикриттів Мікати, якщо гравець їх не розкрив.</w:t>
+        <w:t>Райдо є видимим щитом і політичним запобіжником. Він не ходить слідом за Токарою й не розв’язує його сцени. Його функції: підтвердити наказ, перекрити коридор, надати двох людей, витримати офіційний тиск, організувати евакуацію. Він не знає всіх прикриттів Токари, якщо гравець їх не розкрив.</w:t>
       </w:r>
     </w:p>
     <w:p>
@@ -2745,7 +2745,7 @@
         <w:spacing w:after="40"/>
       </w:pPr>
       <w:r>
-        <w:t>Старші спадкоємці використають звинувачення як привід заарештувати Куреху й Мікату.</w:t>
+        <w:t>Старші спадкоємці використають звинувачення як привід заарештувати Куреху й Токару.</w:t>
       </w:r>
     </w:p>
     <w:p>
@@ -3437,7 +3437,7 @@
         <w:spacing w:after="40"/>
       </w:pPr>
       <w:r>
-        <w:t>Справжні термінові повідомлення Міката залишає у мідній трубі під третім умивальником баржі VI. Райдо перевіряє її на світанку й після вечірнього дзвону.</w:t>
+        <w:t>Справжні термінові повідомлення Токара залишає у мідній трубі під третім умивальником баржі VI. Райдо перевіряє її на світанку й після вечірнього дзвону.</w:t>
       </w:r>
     </w:p>
     <w:p>
@@ -3605,7 +3605,7 @@
               </w:rPr>
               <w:t>Захистити контракт, цивільних і стратегічний маршрут; не стати придворною зброєю.</w:t>
               <w:br/>
-              <w:t>Міката, Райдо, 4 чуніни, медик, зв’язок.</w:t>
+              <w:t>Токара, Райдо, 4 чуніни, медик, зв’язок.</w:t>
               <w:br/>
               <w:t>Цунаде може зупинити церемонію лише за доказу масової загрози.</w:t>
             </w:r>
@@ -4318,10 +4318,10 @@
         <w:rPr>
           <w:b/>
         </w:rPr>
-        <w:t xml:space="preserve">Ставлення до Мікати: </w:t>
-      </w:r>
-      <w:r>
-        <w:t>Поважає компетентність і спокій. Спробує завербувати Мікату, щойно запідозрить його справжній рівень.</w:t>
+        <w:t xml:space="preserve">Ставлення до Токари: </w:t>
+      </w:r>
+      <w:r>
+        <w:t>Поважає компетентність і спокій. Спробує завербувати Токару, щойно запідозрить його справжній рівень.</w:t>
       </w:r>
     </w:p>
     <w:p>
@@ -4441,7 +4441,7 @@
         <w:t xml:space="preserve">Перший хід: </w:t>
       </w:r>
       <w:r>
-        <w:t>Запрошує Куреху на спільну молитву й просить Мікату залишитися зовні.</w:t>
+        <w:t>Запрошує Куреху на спільну молитву й просить Токару залишитися зовні.</w:t>
       </w:r>
     </w:p>
     <w:p>
@@ -4452,10 +4452,10 @@
         <w:rPr>
           <w:b/>
         </w:rPr>
-        <w:t xml:space="preserve">Ставлення до Мікати: </w:t>
-      </w:r>
-      <w:r>
-        <w:t>Не намагається купити Мікату. Вона хоче, щоб він сам визнав її морально необхідною.</w:t>
+        <w:t xml:space="preserve">Ставлення до Токари: </w:t>
+      </w:r>
+      <w:r>
+        <w:t>Не намагається купити Токару. Вона хоче, щоб він сам визнав її морально необхідною.</w:t>
       </w:r>
     </w:p>
     <w:p>
@@ -4575,7 +4575,7 @@
         <w:t xml:space="preserve">Перший хід: </w:t>
       </w:r>
       <w:r>
-        <w:t>Пропонує Куресі офіційну угоду про взаємний ненапад і передає монету через Мікату.</w:t>
+        <w:t>Пропонує Куресі офіційну угоду про взаємний ненапад і передає монету через Токару.</w:t>
       </w:r>
     </w:p>
     <w:p>
@@ -4586,10 +4586,10 @@
         <w:rPr>
           <w:b/>
         </w:rPr>
-        <w:t xml:space="preserve">Ставлення до Мікати: </w:t>
-      </w:r>
-      <w:r>
-        <w:t>Швидко розуміє цінність прикриття. Його найнебезпечніша зброя проти Мікати: юридично правильна пропозиція, яку важко відхилити без підозри.</w:t>
+        <w:t xml:space="preserve">Ставлення до Токари: </w:t>
+      </w:r>
+      <w:r>
+        <w:t>Швидко розуміє цінність прикриття. Його найнебезпечніша зброя проти Токари: юридично правильна пропозиція, яку важко відхилити без підозри.</w:t>
       </w:r>
     </w:p>
     <w:p>
@@ -4709,7 +4709,7 @@
         <w:t xml:space="preserve">Перший хід: </w:t>
       </w:r>
       <w:r>
-        <w:t>Просить дозволу намалювати портрет Мікати у прикритті й уважно стежить, чи змінюється Henge під довгим поглядом.</w:t>
+        <w:t>Просить дозволу намалювати портрет Токари у прикритті й уважно стежить, чи змінюється Henge під довгим поглядом.</w:t>
       </w:r>
     </w:p>
     <w:p>
@@ -4720,10 +4720,10 @@
         <w:rPr>
           <w:b/>
         </w:rPr>
-        <w:t xml:space="preserve">Ставлення до Мікати: </w:t>
-      </w:r>
-      <w:r>
-        <w:t>Бажає не завербувати, а «зрозуміти». Якщо Міката відмовляє йому в доступі, Шігуре стає особисто зацікавленим.</w:t>
+        <w:t xml:space="preserve">Ставлення до Токари: </w:t>
+      </w:r>
+      <w:r>
+        <w:t>Бажає не завербувати, а «зрозуміти». Якщо Токара відмовляє йому в доступі, Шігуре стає особисто зацікавленим.</w:t>
       </w:r>
     </w:p>
     <w:p>
@@ -4854,10 +4854,10 @@
         <w:rPr>
           <w:b/>
         </w:rPr>
-        <w:t xml:space="preserve">Ставлення до Мікати: </w:t>
-      </w:r>
-      <w:r>
-        <w:t>Поважає конкретні докази. Вона може стати найкращою союзницею Мікати, якщо він не моралізує й не приховує ризики.</w:t>
+        <w:t xml:space="preserve">Ставлення до Токари: </w:t>
+      </w:r>
+      <w:r>
+        <w:t>Поважає конкретні докази. Вона може стати найкращою союзницею Токари, якщо він не моралізує й не приховує ризики.</w:t>
       </w:r>
     </w:p>
     <w:p>
@@ -4988,10 +4988,10 @@
         <w:rPr>
           <w:b/>
         </w:rPr>
-        <w:t xml:space="preserve">Ставлення до Мікати: </w:t>
-      </w:r>
-      <w:r>
-        <w:t>Намагається зробити Мікату частиною вистави, бо публічна роль ускладнить зміну прикриття.</w:t>
+        <w:t xml:space="preserve">Ставлення до Токари: </w:t>
+      </w:r>
+      <w:r>
+        <w:t>Намагається зробити Токару частиною вистави, бо публічна роль ускладнить зміну прикриття.</w:t>
       </w:r>
     </w:p>
     <w:p>
@@ -5111,7 +5111,7 @@
         <w:t xml:space="preserve">Перший хід: </w:t>
       </w:r>
       <w:r>
-        <w:t>Пропонує Мікаті сигарети й чесно каже, що на баржі є вантаж, про який Коноха не повинна знати.</w:t>
+        <w:t>Пропонує Токарі сигарети й чесно каже, що на баржі є вантаж, про який Коноха не повинна знати.</w:t>
       </w:r>
     </w:p>
     <w:p>
@@ -5122,7 +5122,7 @@
         <w:rPr>
           <w:b/>
         </w:rPr>
-        <w:t xml:space="preserve">Ставлення до Мікати: </w:t>
+        <w:t xml:space="preserve">Ставлення до Токари: </w:t>
       </w:r>
       <w:r>
         <w:t>Ненавидить допити, але любить торг. Видасть важливу правду, якщо плата дозволяє йому уникнути відповідальності.</w:t>
@@ -5256,10 +5256,10 @@
         <w:rPr>
           <w:b/>
         </w:rPr>
-        <w:t xml:space="preserve">Ставлення до Мікати: </w:t>
-      </w:r>
-      <w:r>
-        <w:t>Мікату вважає доказом того, що система використовує людей без імені. Може поважати його або спробувати публічно розкрити прикриття.</w:t>
+        <w:t xml:space="preserve">Ставлення до Токари: </w:t>
+      </w:r>
+      <w:r>
+        <w:t>Токару вважає доказом того, що система використовує людей без імені. Може поважати його або спробувати публічно розкрити прикриття.</w:t>
       </w:r>
     </w:p>
     <w:p>
@@ -5365,7 +5365,7 @@
         <w:t xml:space="preserve">Ресурси: </w:t>
       </w:r>
       <w:r>
-        <w:t>5 охоронців, 3 служниці, стара вихователька Шіное, Міката. Грошей і впливу майже немає.</w:t>
+        <w:t>5 охоронців, 3 служниці, стара вихователька Шіное, Токара. Грошей і впливу майже немає.</w:t>
       </w:r>
     </w:p>
     <w:p>
@@ -5379,7 +5379,7 @@
         <w:t xml:space="preserve">Перший хід: </w:t>
       </w:r>
       <w:r>
-        <w:t>У першу ніч просить Мікату не перевіряти її чорнильницю. Якщо він наполягає, вона наказує як господиня, а не просить як клієнтка.</w:t>
+        <w:t>У першу ніч просить Токару не перевіряти її чорнильницю. Якщо він наполягає, вона наказує як господиня, а не просить як клієнтка.</w:t>
       </w:r>
     </w:p>
     <w:p>
@@ -5390,10 +5390,10 @@
         <w:rPr>
           <w:b/>
         </w:rPr>
-        <w:t xml:space="preserve">Ставлення до Мікати: </w:t>
-      </w:r>
-      <w:r>
-        <w:t>Поступово починає покладатися на Мікату, але під тиском може підробити доказ проти іншого спадкоємця, переконуючи себе, що це єдиний шлях.</w:t>
+        <w:t xml:space="preserve">Ставлення до Токари: </w:t>
+      </w:r>
+      <w:r>
+        <w:t>Поступово починає покладатися на Токару, але під тиском може підробити доказ проти іншого спадкоємця, переконуючи себе, що це єдиний шлях.</w:t>
       </w:r>
     </w:p>
     <w:p>
@@ -5569,7 +5569,7 @@
               <w:rPr>
                 <w:sz w:val="16"/>
               </w:rPr>
-              <w:t>Контролює розвідчастину. Його питання до Мікати завжди про знання та мотиви: хто що бачив, хто вважає це правдою, кому вигідна версія. Не вгадує таємниць за гравця.</w:t>
+              <w:t>Контролює розвідчастину. Його питання до Токари завжди про знання та мотиви: хто що бачив, хто вважає це правдою, кому вигідна версія. Не вгадує таємниць за гравця.</w:t>
             </w:r>
           </w:p>
         </w:tc>
@@ -5617,7 +5617,7 @@
               <w:rPr>
                 <w:sz w:val="16"/>
               </w:rPr>
-              <w:t>Офіційний представник Конохи на каравані. Спокійний, небагатослівний, не соромиться шрамів і не пояснює їх. Відкрито захищає контракт, таємно дає Мікаті простір.</w:t>
+              <w:t>Офіційний представник Конохи на каравані. Спокійний, небагатослівний, не соромиться шрамів і не пояснює їх. Відкрито захищає контракт, таємно дає Токарі простір.</w:t>
             </w:r>
           </w:p>
         </w:tc>
@@ -6563,7 +6563,7 @@
               <w:rPr>
                 <w:sz w:val="16"/>
               </w:rPr>
-              <w:t>Міката з прихованою чакрою</w:t>
+              <w:t>Токара з прихованою чакрою</w:t>
             </w:r>
           </w:p>
         </w:tc>
@@ -6650,12 +6650,12 @@
         <w:pStyle w:val="Heading2"/>
       </w:pPr>
       <w:r>
-        <w:t>Міні-курс Мікати</w:t>
-      </w:r>
-    </w:p>
-    <w:p>
-      <w:r>
-        <w:t>На третій день Міката може запропонувати нейтральне навчання по одному представнику від кожного двору. Це аналог стратегічного «вирівнювання поля»: слабші починають бачити загрозу, сильніші втрачають монополію на секрет. Навчання триває трьома короткими заняттями.</w:t>
+        <w:t>Міні-курс Токари</w:t>
+      </w:r>
+    </w:p>
+    <w:p>
+      <w:r>
+        <w:t>На третій день Токара може запропонувати нейтральне навчання по одному представнику від кожного двору. Це аналог стратегічного «вирівнювання поля»: слабші починають бачити загрозу, сильніші втрачають монополію на секрет. Навчання триває трьома короткими заняттями.</w:t>
       </w:r>
     </w:p>
     <w:tbl>
@@ -6893,7 +6893,7 @@
         <w:t xml:space="preserve">Ціна: </w:t>
       </w:r>
       <w:r>
-        <w:t>спадкоємці навчають своїх охоронців; секрети сенсорної дисципліни Конохи розходяться; у клас може проникнути вбивця; Саданобу дізнається, що Міката розуміє систему.</w:t>
+        <w:t>спадкоємці навчають своїх охоронців; секрети сенсорної дисципліни Конохи розходяться; у клас може проникнути вбивця; Саданобу дізнається, що Токара розуміє систему.</w:t>
       </w:r>
     </w:p>
     <w:p>
@@ -6985,7 +6985,7 @@
         <w:t xml:space="preserve">1.  </w:t>
       </w:r>
       <w:r>
-        <w:t>Зафіксувати буквальну дію. Не додавати Мікаті думок, емоцій, планів або рухів, яких гравець не написав.</w:t>
+        <w:t>Зафіксувати буквальну дію. Не додавати Токарі думок, емоцій, планів або рухів, яких гравець не написав.</w:t>
       </w:r>
     </w:p>
     <w:p>
@@ -7252,7 +7252,7 @@
               <w:rPr>
                 <w:sz w:val="16"/>
               </w:rPr>
-              <w:t>Міката: баржа/кімната. Куреха. Райдо. Ціль сцени. Перекриті переходи.</w:t>
+              <w:t>Токара: баржа/кімната. Куреха. Райдо. Ціль сцени. Перекриті переходи.</w:t>
             </w:r>
           </w:p>
         </w:tc>
@@ -7300,7 +7300,7 @@
               <w:rPr>
                 <w:sz w:val="16"/>
               </w:rPr>
-              <w:t>Що знає Міката. Що думає, але не знає. Хто бачив його техніку. Хто знає прикриття.</w:t>
+              <w:t>Що знає Токара. Що думає, але не знає. Хто бачив його техніку. Хто знає прикриття.</w:t>
             </w:r>
           </w:p>
         </w:tc>
@@ -7517,7 +7517,7 @@
         <w:spacing w:after="40"/>
       </w:pPr>
       <w:r>
-        <w:t>NPC знає справжнє ім’я Мікати лише тому, що це драматично.</w:t>
+        <w:t>NPC знає справжнє ім’я Токари лише тому, що це драматично.</w:t>
       </w:r>
     </w:p>
     <w:p>
@@ -7738,7 +7738,7 @@
               <w:rPr>
                 <w:sz w:val="16"/>
               </w:rPr>
-              <w:t>Хочу вижити без батька в голові. Боюся бути нікчемною жертвою. Наступним приховаю доказ, якщо Міката спробує передати контроль двору.</w:t>
+              <w:t>Хочу вижити без батька в голові. Боюся бути нікчемною жертвою. Наступним приховаю доказ, якщо Токара спробує передати контроль двору.</w:t>
             </w:r>
           </w:p>
         </w:tc>
@@ -7882,7 +7882,7 @@
               <w:rPr>
                 <w:sz w:val="16"/>
               </w:rPr>
-              <w:t>Хочу виконати контракт і не підставити Мікату. Боюся відкритого конфлікту з двором. Наступним створю законну причину для потрібного перекриття.</w:t>
+              <w:t>Хочу виконати контракт і не підставити Токару. Боюся відкритого конфлікту з двором. Наступним створю законну причину для потрібного перекриття.</w:t>
             </w:r>
           </w:p>
         </w:tc>
@@ -7953,12 +7953,12 @@
         <w:pStyle w:val="Heading2"/>
       </w:pPr>
       <w:r>
-        <w:t>Викриття Мікати  [0-5]</w:t>
-      </w:r>
-    </w:p>
-    <w:p>
-      <w:r>
-        <w:t>Зростає після помилок Henge, демонстрації технік, невідповідностей біографії, підозри Шігуре або публічного наказу Райдо. На 3 старші двори знають, що серед писарів є шинобі. На 5 ім’я й роль Мікати стають політичним фактом.</w:t>
+        <w:t>Викриття Токари  [0-5]</w:t>
+      </w:r>
+    </w:p>
+    <w:p>
+      <w:r>
+        <w:t>Зростає після помилок Henge, демонстрації технік, невідповідностей біографії, підозри Шігуре або публічного наказу Райдо. На 3 старші двори знають, що серед писарів є шинобі. На 5 ім’я й роль Токари стають політичним фактом.</w:t>
       </w:r>
     </w:p>
     <w:p>
@@ -7984,7 +7984,7 @@
     </w:p>
     <w:p>
       <w:r>
-        <w:t>Починається на 2. Зростає, якщо Міката дає їй реальний вибір і пояснює ризик. Падає, якщо використовує її як приманку без згоди, передає її секрети або ставиться як до дитини. На 0 вона тікає у власний план. На 6 віддає оригінальний уривок без страховки.</w:t>
+        <w:t>Починається на 2. Зростає, якщо Токара дає їй реальний вибір і пояснює ризик. Падає, якщо використовує її як приманку без згоди, передає її секрети або ставиться як до дитини. На 0 вона тікає у власний план. На 6 віддає оригінальний уривок без страховки.</w:t>
       </w:r>
     </w:p>
     <w:p>
@@ -8362,7 +8362,7 @@
         <w:pStyle w:val="Lead"/>
       </w:pPr>
       <w:r>
-        <w:t>Нижче не обов’язковий сюжет, а розклад дій NPC, якщо Міката нічого не змінює. Після втручання GM переписує майбутні кроки, не намагаючись повернути їх у початковий порядок.</w:t>
+        <w:t>Нижче не обов’язковий сюжет, а розклад дій NPC, якщо Токара нічого не змінює. Після втручання GM переписує майбутні кроки, не намагаючись повернути їх у початковий порядок.</w:t>
       </w:r>
     </w:p>
     <w:tbl>
@@ -8468,7 +8468,7 @@
               <w:rPr>
                 <w:sz w:val="16"/>
               </w:rPr>
-              <w:t>Брифінг. Міката отримує прикриття. Асума називає три придворні правила. Перед від’їздом невідомий уже перевіряв архів Кей Мацуди.</w:t>
+              <w:t>Брифінг. Токара отримує прикриття. Асума називає три придворні правила. Перед від’їздом невідомий уже перевіряв архів Кей Мацуди.</w:t>
             </w:r>
           </w:p>
         </w:tc>
@@ -8612,7 +8612,7 @@
               <w:rPr>
                 <w:sz w:val="16"/>
               </w:rPr>
-              <w:t>Кійоне пропонує загальний медичний огляд. Міката може запустити міні-курс виявлення чакрових контурів. Саданобу посилає спостерігача в клас. Один учасник уже має знак Мідзуе.</w:t>
+              <w:t>Кійоне пропонує загальний медичний огляд. Токара може запустити міні-курс виявлення чакрових контурів. Саданобу посилає спостерігача в клас. Один учасник уже має знак Мідзуе.</w:t>
             </w:r>
           </w:p>
         </w:tc>
@@ -8852,7 +8852,7 @@
               <w:rPr>
                 <w:sz w:val="16"/>
               </w:rPr>
-              <w:t>Ріцу шукає Мікату. Він приносить лаковану пластину з образом Курехи біля святині й чужим старим обличчям поверх її рис. Шігуре вже знає про втечу секретаря, але не знає, кому він довірився.</w:t>
+              <w:t>Ріцу шукає Токару. Він приносить лаковану пластину з образом Курехи біля святині й чужим старим обличчям поверх її рис. Шігуре вже знає про втечу секретаря, але не знає, кому він довірився.</w:t>
             </w:r>
           </w:p>
         </w:tc>
@@ -8996,7 +8996,7 @@
               <w:rPr>
                 <w:sz w:val="16"/>
               </w:rPr>
-              <w:t>Мідзуе або інша сторона саботує механізм шлюзу. Караван може врізатися у кам’яний зуб. Міката мусить розподілити час між доказами, Кureхою, ритуальною баржею й порятунком нижніх палуб.</w:t>
+              <w:t>Мідзуе або інша сторона саботує механізм шлюзу. Караван може врізатися у кам’яний зуб. Токара мусить розподілити час між доказами, Кureхою, ритуальною баржею й порятунком нижніх палуб.</w:t>
             </w:r>
           </w:p>
         </w:tc>
@@ -9143,7 +9143,7 @@
               <w:rPr>
                 <w:sz w:val="16"/>
               </w:rPr>
-              <w:t>Міката викрив ритуал у День 2</w:t>
+              <w:t>Токара викрив ритуал у День 2</w:t>
             </w:r>
           </w:p>
         </w:tc>
@@ -9600,7 +9600,7 @@
         <w:t xml:space="preserve">Слід: </w:t>
       </w:r>
       <w:r>
-        <w:t>Міката відчуває тонкий контур лише після того, як монета торкається шкіри.</w:t>
+        <w:t>Токара відчуває тонкий контур лише після того, як монета торкається шкіри.</w:t>
       </w:r>
     </w:p>
     <w:p>
@@ -9784,7 +9784,7 @@
         <w:t xml:space="preserve">Слід: </w:t>
       </w:r>
       <w:r>
-        <w:t>На ескізі тінь Мікати має інше положення волосся, ніж прикриття.</w:t>
+        <w:t>На ескізі тінь Токари має інше положення волосся, ніж прикриття.</w:t>
       </w:r>
     </w:p>
     <w:p>
@@ -9798,7 +9798,7 @@
         <w:t xml:space="preserve">Провал не блокує: </w:t>
       </w:r>
       <w:r>
-        <w:t>Відмова підвищує інтерес Шігуре; згода дає Мікаті доступ до галереї.</w:t>
+        <w:t>Відмова підвищує інтерес Шігуре; згода дає Токарі доступ до галереї.</w:t>
       </w:r>
     </w:p>
     <w:p>
@@ -9926,7 +9926,7 @@
         <w:t xml:space="preserve">Поверхня: </w:t>
       </w:r>
       <w:r>
-        <w:t>Міцую просить Мікату вийти.</w:t>
+        <w:t>Міцую просить Токару вийти.</w:t>
       </w:r>
     </w:p>
     <w:p>
@@ -9954,7 +9954,7 @@
         <w:t xml:space="preserve">Хід NPC: </w:t>
       </w:r>
       <w:r>
-        <w:t>Якщо Міката лишається, храмова охорона ставить питання про його статус.</w:t>
+        <w:t>Якщо Токара лишається, храмова охорона ставить питання про його статус.</w:t>
       </w:r>
     </w:p>
     <w:p>
@@ -10046,7 +10046,7 @@
         <w:t xml:space="preserve">Хід NPC: </w:t>
       </w:r>
       <w:r>
-        <w:t>Ренга викликає Мікату на сцену як «найсуворішого писаря каравану».</w:t>
+        <w:t>Ренга викликає Токару на сцену як «найсуворішого писаря каравану».</w:t>
       </w:r>
     </w:p>
     <w:p>
@@ -10280,7 +10280,7 @@
         <w:t xml:space="preserve">Коли використовувати: </w:t>
       </w:r>
       <w:r>
-        <w:t>Після того як Шігуре підозрює Мікату.</w:t>
+        <w:t>Після того як Шігуре підозрює Токару.</w:t>
       </w:r>
     </w:p>
     <w:p>
@@ -10350,7 +10350,7 @@
         <w:t xml:space="preserve">Провал не блокує: </w:t>
       </w:r>
       <w:r>
-        <w:t>Якщо Ріцу схоплять, він може залишити Мікаті опис через ритм постукування.</w:t>
+        <w:t>Якщо Ріцу схоплять, він може залишити Токарі опис через ритм постукування.</w:t>
       </w:r>
     </w:p>
     <w:p>
@@ -10414,7 +10414,7 @@
         <w:t xml:space="preserve">Хід NPC: </w:t>
       </w:r>
       <w:r>
-        <w:t>Голос називає Мікату не його ім’ям, а роллю, яку він найбільше боїться втратити.</w:t>
+        <w:t>Голос називає Токару не його ім’ям, а роллю, яку він найбільше боїться втратити.</w:t>
       </w:r>
     </w:p>
     <w:p>
@@ -10506,7 +10506,7 @@
         <w:t xml:space="preserve">Хід NPC: </w:t>
       </w:r>
       <w:r>
-        <w:t>Саданобу пропонує Мікаті угоду: зберегти Куреху як особу, якщо інший спадкоємець прийме пам’ять.</w:t>
+        <w:t>Саданобу пропонує Токарі угоду: зберегти Куреху як особу, якщо інший спадкоємець прийме пам’ять.</w:t>
       </w:r>
     </w:p>
     <w:p>
@@ -11806,7 +11806,7 @@
               <w:rPr>
                 <w:sz w:val="16"/>
               </w:rPr>
-              <w:t>5. Вогонь + кендзюцу. Не женеться за Мікатою без наказу. Слабкість: буквальна відданість і страх втратити честь перед солдатами.</w:t>
+              <w:t>5. Вогонь + кендзюцу. Не женеться за Токарою без наказу. Слабкість: буквальна відданість і страх втратити честь перед солдатами.</w:t>
             </w:r>
           </w:p>
         </w:tc>
@@ -11854,7 +11854,7 @@
               <w:rPr>
                 <w:sz w:val="16"/>
               </w:rPr>
-              <w:t>4 у бою / 6 у печатній зоні. Бар’єри, глушіння чакри, переміщення замків і дверей. У відкритому просторі фізично слабший за Мікату.</w:t>
+              <w:t>4 у бою / 6 у печатній зоні. Бар’єри, глушіння чакри, переміщення замків і дверей. У відкритому просторі фізично слабший за Токару.</w:t>
             </w:r>
           </w:p>
         </w:tc>
@@ -12325,7 +12325,7 @@
               <w:rPr>
                 <w:sz w:val="16"/>
               </w:rPr>
-              <w:t>Право відмови відновлено. Вона передає доказ Арітомо або публікує його. Місія захисту виконана, але посада лишається іншому спадкоємцю. Куреха може стати незалежною союзницею Конохи або ненавидіти Мікату за те, що він не допоміг їй змінити систему.</w:t>
+              <w:t>Право відмови відновлено. Вона передає доказ Арітомо або публікує його. Місія захисту виконана, але посада лишається іншому спадкоємцю. Куреха може стати незалежною союзницею Конохи або ненавидіти Токару за те, що він не допоміг їй змінити систему.</w:t>
             </w:r>
           </w:p>
         </w:tc>
@@ -13096,7 +13096,7 @@
         <w:spacing w:after="40"/>
       </w:pPr>
       <w:r>
-        <w:t>Ібікі створює закритий архів автономних печатей і просить Мікату перевірити схожий випадок у іншій країні.</w:t>
+        <w:t>Ібікі створює закритий архів автономних печатей і просить Токару перевірити схожий випадок у іншій країні.</w:t>
       </w:r>
     </w:p>
     <w:p>
@@ -13123,7 +13123,7 @@
         <w:spacing w:after="40"/>
       </w:pPr>
       <w:r>
-        <w:t>Куреха просить Мікату знайти решту людей, причетних до смерті матері.</w:t>
+        <w:t>Куреха просить Токару знайти решту людей, причетних до смерті матері.</w:t>
       </w:r>
     </w:p>
     <w:p>
@@ -13141,7 +13141,7 @@
         <w:spacing w:after="40"/>
       </w:pPr>
       <w:r>
-        <w:t>Арітомо пропонує Мікаті придворну посаду, що фактично зробить його очима даймьо всередині Конохи.</w:t>
+        <w:t>Арітомо пропонує Токарі придворну посаду, що фактично зробить його очима даймьо всередині Конохи.</w:t>
       </w:r>
     </w:p>
     <w:p>
@@ -14461,7 +14461,7 @@
               <w:spacing w:after="40"/>
             </w:pPr>
             <w:r>
-              <w:t>Де Міката? Хто фізично поруч? Хто знає його справжню роль? Який NPC має наступний хід? Який один годинник може змінитися? Який конкретний наслідок щойно створила дія гравця?</w:t>
+              <w:t>Де Токара? Хто фізично поруч? Хто знає його справжню роль? Який NPC має наступний хід? Який один годинник може змінитися? Який конкретний наслідок щойно створила дія гравця?</w:t>
             </w:r>
           </w:p>
         </w:tc>
@@ -14704,7 +14704,7 @@
               <w:rPr>
                 <w:sz w:val="18"/>
               </w:rPr>
-              <w:t>Викриття Мікати</w:t>
+              <w:t>Викриття Токари</w:t>
             </w:r>
           </w:p>
         </w:tc>
@@ -14945,7 +14945,7 @@
               <w:rPr>
                 <w:sz w:val="16"/>
               </w:rPr>
-              <w:t>Приховує чорнильницю й перевіряє, чи Міката виконує накази буквально.</w:t>
+              <w:t>Приховує чорнильницю й перевіряє, чи Токара виконує накази буквально.</w:t>
             </w:r>
           </w:p>
         </w:tc>
@@ -16097,7 +16097,7 @@
         <w:spacing w:after="40"/>
       </w:pPr>
       <w:r>
-        <w:t>Чи збережено прикриття Мікати, і чи це ще має значення?</w:t>
+        <w:t>Чи збережено прикриття Токари, і чи це ще має значення?</w:t>
       </w:r>
     </w:p>
     <w:p>
@@ -16106,7 +16106,7 @@
         <w:spacing w:after="40"/>
       </w:pPr>
       <w:r>
-        <w:t>Що Куреха зробить сама, якщо Міката нічого їй не скаже?</w:t>
+        <w:t>Що Куреха зробить сама, якщо Токара нічого їй не скаже?</w:t>
       </w:r>
     </w:p>
     <w:p>
@@ -16162,7 +16162,7 @@
               <w:spacing w:after="40"/>
             </w:pPr>
             <w:r>
-              <w:t>Не захищай задуманий фінал від гравця. Захищай причинність світу. Якщо Міката знайшов спосіб, який логічно працює, дозволь йому змінити арку. Наслідок має бути складним, але не скасованим авторською рукою.</w:t>
+              <w:t>Не захищай задуманий фінал від гравця. Захищай причинність світу. Якщо Токара знайшов спосіб, який логічно працює, дозволь йому змінити арку. Наслідок має бути складним, але не скасованим авторською рукою.</w:t>
             </w:r>
           </w:p>
         </w:tc>

</xml_diff>